<commit_message>
Update 8. Worksheet_PABW_Pertemuan8 - ID.docx
</commit_message>
<xml_diff>
--- a/pertemuan 8/8. Worksheet_PABW_Pertemuan8 - ID.docx
+++ b/pertemuan 8/8. Worksheet_PABW_Pertemuan8 - ID.docx
@@ -9901,7 +9901,13 @@
               <w:spacing w:before="20" w:after="20" w:line="252" w:lineRule="auto"/>
             </w:pPr>
             <w:r>
-              <w:t>Ya berhasil, se</w:t>
+              <w:t>S</w:t>
+            </w:r>
+            <w:r>
+              <w:t>esuai</w:t>
+            </w:r>
+            <w:r>
+              <w:t>, se</w:t>
             </w:r>
             <w:r>
               <w:t>luruh isi tampil sebagai tabel, dan jumlahnya baris sama dengan isi array.</w:t>
@@ -9975,6 +9981,18 @@
             <w:pPr>
               <w:spacing w:before="20" w:after="20" w:line="252" w:lineRule="auto"/>
             </w:pPr>
+            <w:r>
+              <w:t>S</w:t>
+            </w:r>
+            <w:r>
+              <w:t xml:space="preserve">esuai, </w:t>
+            </w:r>
+            <w:r>
+              <w:t>hanya tampil 1 proyek</w:t>
+            </w:r>
+            <w:r>
+              <w:t xml:space="preserve"> yang sesuai</w:t>
+            </w:r>
           </w:p>
         </w:tc>
       </w:tr>
@@ -10044,6 +10062,12 @@
             <w:pPr>
               <w:spacing w:before="20" w:after="20" w:line="252" w:lineRule="auto"/>
             </w:pPr>
+            <w:r>
+              <w:t xml:space="preserve">Sesuai, </w:t>
+            </w:r>
+            <w:r>
+              <w:t>hanya menampilkan 1 object.</w:t>
+            </w:r>
           </w:p>
         </w:tc>
       </w:tr>
@@ -10113,6 +10137,18 @@
             <w:pPr>
               <w:spacing w:before="20" w:after="20" w:line="252" w:lineRule="auto"/>
             </w:pPr>
+            <w:r>
+              <w:t>Sesuai,</w:t>
+            </w:r>
+            <w:r>
+              <w:t xml:space="preserve"> </w:t>
+            </w:r>
+            <w:r>
+              <w:t>p</w:t>
+            </w:r>
+            <w:r>
+              <w:t xml:space="preserve">anjang array hasil sama dengan array asal </w:t>
+            </w:r>
           </w:p>
         </w:tc>
       </w:tr>
@@ -10182,6 +10218,12 @@
             <w:pPr>
               <w:spacing w:before="20" w:after="20" w:line="252" w:lineRule="auto"/>
             </w:pPr>
+            <w:r>
+              <w:t>Sesuai,</w:t>
+            </w:r>
+            <w:r>
+              <w:t xml:space="preserve"> urutannya tetap sama dan tidak berubah.</w:t>
+            </w:r>
           </w:p>
         </w:tc>
       </w:tr>

</xml_diff>